<commit_message>
finales Mapping soweit cleaning_wahldaten entfernt
</commit_message>
<xml_diff>
--- a/MeinMaterial/Bachelorarbeitsentwurf.docx
+++ b/MeinMaterial/Bachelorarbeitsentwurf.docx
@@ -1167,7 +1167,23 @@
     </w:p>
     <w:p>
       <w:r>
-        <w:t>Die resultierenden Einheiten werden durch einen selbst erzeugten agg.schlüssel identifiziert. Dieser besteht aus der sortierten Menge aller amtlichen Gemeindeschlüssel, die gemeinsam eine räumlich und rechnerisch vergleichbare Einheit bilden. Für nicht betroffene Gemeinden entspricht der agg.schlüssel dem einzelnen Gemeindeschlüssel; bei notwendigen Zusammenfassungen enthält er mehrere Gemeindeschlüssel.</w:t>
+        <w:t xml:space="preserve">Die resultierenden Einheiten werden durch einen selbst erzeugten </w:t>
+      </w:r>
+      <w:proofErr w:type="spellStart"/>
+      <w:r>
+        <w:t>agg.schlüssel</w:t>
+      </w:r>
+      <w:proofErr w:type="spellEnd"/>
+      <w:r>
+        <w:t xml:space="preserve"> identifiziert. Dieser besteht aus der sortierten Menge aller amtlichen Gemeindeschlüssel, die gemeinsam eine räumlich und rechnerisch vergleichbare Einheit bilden. Für nicht betroffene Gemeinden entspricht der </w:t>
+      </w:r>
+      <w:proofErr w:type="spellStart"/>
+      <w:r>
+        <w:t>agg.schlüssel</w:t>
+      </w:r>
+      <w:proofErr w:type="spellEnd"/>
+      <w:r>
+        <w:t xml:space="preserve"> dem einzelnen Gemeindeschlüssel; bei notwendigen Zusammenfassungen enthält er mehrere Gemeindeschlüssel.</w:t>
       </w:r>
     </w:p>
     <w:p>
@@ -1414,7 +1430,15 @@
     </w:p>
     <w:p>
       <w:r>
-        <w:t>Für jedes Wahljahr wird zunächst ein Mapping erstellt, das jede Kombination aus Wahlkreis und Gemeindeschlüssel einem agg.schlüssel zuordnet. Dabei gelten drei Grundfälle:</w:t>
+        <w:t xml:space="preserve">Für jedes Wahljahr wird zunächst ein Mapping erstellt, das jede Kombination aus Wahlkreis und Gemeindeschlüssel einem </w:t>
+      </w:r>
+      <w:proofErr w:type="spellStart"/>
+      <w:r>
+        <w:t>agg.schlüssel</w:t>
+      </w:r>
+      <w:proofErr w:type="spellEnd"/>
+      <w:r>
+        <w:t xml:space="preserve"> zuordnet. Dabei gelten drei Grundfälle:</w:t>
       </w:r>
     </w:p>
     <w:p>
@@ -1425,7 +1449,15 @@
         </w:numPr>
       </w:pPr>
       <w:r>
-        <w:t xml:space="preserve">Ist das Ergebnis einer Gemeinde vollständig und eindeutig dieser Gemeinde zugeordnet, entspricht der agg.schlüssel ihrem eigenen AGS. </w:t>
+        <w:t xml:space="preserve">Ist das Ergebnis einer Gemeinde vollständig und eindeutig dieser Gemeinde zugeordnet, entspricht der </w:t>
+      </w:r>
+      <w:proofErr w:type="spellStart"/>
+      <w:r>
+        <w:t>agg.schlüssel</w:t>
+      </w:r>
+      <w:proofErr w:type="spellEnd"/>
+      <w:r>
+        <w:t xml:space="preserve"> ihrem eigenen AGS. </w:t>
       </w:r>
     </w:p>
     <w:p>
@@ -1436,7 +1468,15 @@
         </w:numPr>
       </w:pPr>
       <w:r>
-        <w:t xml:space="preserve">Sind Wahlergebnisse mehrerer Gemeinden gemeinsam ausgezählt oder veröffentlicht worden, erhalten alle beteiligten Gemeinden denselben zusammengesetzten agg.schlüssel. </w:t>
+        <w:t xml:space="preserve">Sind Wahlergebnisse mehrerer Gemeinden gemeinsam ausgezählt oder veröffentlicht worden, erhalten alle beteiligten Gemeinden denselben zusammengesetzten </w:t>
+      </w:r>
+      <w:proofErr w:type="spellStart"/>
+      <w:r>
+        <w:t>agg.schlüssel</w:t>
+      </w:r>
+      <w:proofErr w:type="spellEnd"/>
+      <w:r>
+        <w:t xml:space="preserve">. </w:t>
       </w:r>
     </w:p>
     <w:p>
@@ -1467,7 +1507,15 @@
     </w:p>
     <w:p>
       <w:r>
-        <w:t xml:space="preserve">Der agg.schlüssel ist somit keine beliebige regionale Klassifikation. Er bezeichnet die </w:t>
+        <w:t xml:space="preserve">Der </w:t>
+      </w:r>
+      <w:proofErr w:type="spellStart"/>
+      <w:r>
+        <w:t>agg.schlüssel</w:t>
+      </w:r>
+      <w:proofErr w:type="spellEnd"/>
+      <w:r>
+        <w:t xml:space="preserve"> ist somit keine beliebige regionale Klassifikation. Er bezeichnet die </w:t>
       </w:r>
       <w:r>
         <w:rPr>
@@ -1513,7 +1561,14 @@
       </w:r>
       <w:r>
         <w:br/>
-        <w:t>Gemeinde ≥ 900: künstlicher gemeinsamer Briefwahlbezirk</w:t>
+      </w:r>
+      <w:proofErr w:type="spellStart"/>
+      <w:r>
+        <w:t>Gemeinde</w:t>
+      </w:r>
+      <w:proofErr w:type="spellEnd"/>
+      <w:r>
+        <w:t xml:space="preserve"> ≥ 900: künstlicher gemeinsamer Briefwahlbezirk</w:t>
       </w:r>
     </w:p>
     <w:p>
@@ -1583,7 +1638,23 @@
     </w:p>
     <w:p>
       <w:r>
-        <w:t>Alle realen Gemeinden, die demselben gemeinsamen Briefwahlbezirk zugeordnet sind, erhalten anschließend denselben agg.schlüssel. Der künstliche 9xx-Schlüssel wird nicht als eigenständige Gemeinde interpretiert, sondern ebenfalls auf diesen agg.schlüssel abgebildet.</w:t>
+        <w:t xml:space="preserve">Alle realen Gemeinden, die demselben gemeinsamen Briefwahlbezirk zugeordnet sind, erhalten anschließend denselben </w:t>
+      </w:r>
+      <w:proofErr w:type="spellStart"/>
+      <w:r>
+        <w:t>agg.schlüssel</w:t>
+      </w:r>
+      <w:proofErr w:type="spellEnd"/>
+      <w:r>
+        <w:t xml:space="preserve">. Der künstliche 9xx-Schlüssel wird nicht als eigenständige Gemeinde interpretiert, sondern ebenfalls auf diesen </w:t>
+      </w:r>
+      <w:proofErr w:type="spellStart"/>
+      <w:r>
+        <w:t>agg.schlüssel</w:t>
+      </w:r>
+      <w:proofErr w:type="spellEnd"/>
+      <w:r>
+        <w:t xml:space="preserve"> abgebildet.</w:t>
       </w:r>
     </w:p>
     <w:p>
@@ -1593,19 +1664,51 @@
     </w:p>
     <w:p>
       <w:r>
-        <w:t>Gemeindeschlüssel A → agg.schlüssel A, B, C</w:t>
+        <w:t xml:space="preserve">Gemeindeschlüssel A → </w:t>
+      </w:r>
+      <w:proofErr w:type="spellStart"/>
+      <w:r>
+        <w:t>agg.schlüssel</w:t>
+      </w:r>
+      <w:proofErr w:type="spellEnd"/>
+      <w:r>
+        <w:t xml:space="preserve"> A, B, C</w:t>
       </w:r>
       <w:r>
         <w:br/>
-        <w:t>Gemeindeschlüssel B → agg.schlüssel A, B, C</w:t>
+        <w:t xml:space="preserve">Gemeindeschlüssel B → </w:t>
+      </w:r>
+      <w:proofErr w:type="spellStart"/>
+      <w:r>
+        <w:t>agg.schlüssel</w:t>
+      </w:r>
+      <w:proofErr w:type="spellEnd"/>
+      <w:r>
+        <w:t xml:space="preserve"> A, B, C</w:t>
       </w:r>
       <w:r>
         <w:br/>
-        <w:t>Gemeindeschlüssel C → agg.schlüssel A, B, C</w:t>
+        <w:t xml:space="preserve">Gemeindeschlüssel C → </w:t>
+      </w:r>
+      <w:proofErr w:type="spellStart"/>
+      <w:r>
+        <w:t>agg.schlüssel</w:t>
+      </w:r>
+      <w:proofErr w:type="spellEnd"/>
+      <w:r>
+        <w:t xml:space="preserve"> A, B, C</w:t>
       </w:r>
       <w:r>
         <w:br/>
-        <w:t>künstlicher 9xx-Code → agg.schlüssel A, B, C</w:t>
+        <w:t xml:space="preserve">künstlicher 9xx-Code → </w:t>
+      </w:r>
+      <w:proofErr w:type="spellStart"/>
+      <w:r>
+        <w:t>agg.schlüssel</w:t>
+      </w:r>
+      <w:proofErr w:type="spellEnd"/>
+      <w:r>
+        <w:t xml:space="preserve"> A, B, C</w:t>
       </w:r>
     </w:p>
     <w:p>
@@ -1659,7 +1762,15 @@
         </w:numPr>
       </w:pPr>
       <w:r>
-        <w:t xml:space="preserve">Befinden sie sich in unterschiedlichen Gemeinden, kann das gemeinsame Ergebnis nicht mehr auf die beiden Gemeinden aufgeteilt werden. Beide Gemeinden müssen daher denselben agg.schlüssel erhalten. </w:t>
+        <w:t xml:space="preserve">Befinden sie sich in unterschiedlichen Gemeinden, kann das gemeinsame Ergebnis nicht mehr auf die beiden Gemeinden aufgeteilt werden. Beide Gemeinden müssen daher denselben </w:t>
+      </w:r>
+      <w:proofErr w:type="spellStart"/>
+      <w:r>
+        <w:t>agg.schlüssel</w:t>
+      </w:r>
+      <w:proofErr w:type="spellEnd"/>
+      <w:r>
+        <w:t xml:space="preserve"> erhalten. </w:t>
       </w:r>
     </w:p>
     <w:p>
@@ -1672,7 +1783,43 @@
         <w:t xml:space="preserve">Zu beachten ist, dass die maschinenlesbare §-68-Kennziffer nach der Dokumentation nicht diejenigen Fälle umfasst, in denen kleine Wahlbezirke bereits vor dem Wahltag nach § 12 Absatz 4 BWO zusammengelegt wurden. Bei solchen Fällen werden die aufnehmenden Gemeinden teilweise nur durch Zusätze wie „einschl. Gemeinde …“ im Gemeindenamen gekennzeichnet. Diese Fälle sollten daher ergänzend anhand der Namensfelder oder der amtlichen Begleitdokumentation geprüft werden. </w:t>
       </w:r>
       <w:r>
-        <w:t>Wegen Namensgebensinkonsistenzen und fehlender anderweitiger Ausweisung, ist eine Automatisierung hier fragwürdig. Diese Einzelfälle werden manuell überprüft.</w:t>
+        <w:t xml:space="preserve">Wegen </w:t>
+      </w:r>
+      <w:proofErr w:type="spellStart"/>
+      <w:r>
+        <w:t>Namensgebensinkonsistenzen</w:t>
+      </w:r>
+      <w:proofErr w:type="spellEnd"/>
+      <w:r>
+        <w:t xml:space="preserve"> und fehlender anderweitiger Ausweisung, ist eine Automatisierung hier fragwürdig. Diese Einzelfälle werden manuell überprüft.</w:t>
+      </w:r>
+    </w:p>
+    <w:p>
+      <w:r>
+        <w:br/>
+      </w:r>
+      <w:r>
+        <w:t>  Einige finale Aggregationen können über Wahlkreisgrenzen gehen.</w:t>
+      </w:r>
+    </w:p>
+    <w:p>
+      <w:r>
+        <w:t>  Das entsteht v. a. durch Gemeindegebietsänderungen bzw. große Städte/Gemeinden, nicht durch einen Fehler der Wahldaten.</w:t>
+      </w:r>
+    </w:p>
+    <w:p>
+      <w:r>
+        <w:t>  Diese Fälle sind selten.</w:t>
+      </w:r>
+    </w:p>
+    <w:p>
+      <w:r>
+        <w:t>  Da die Analyse auf harmonisierten Aggregationseinheiten basiert, wird die Vergleichbarkeit 2021/2025 höher gewichtet als maximale Zerlegung in jeder Sonderkonstellation.</w:t>
+      </w:r>
+    </w:p>
+    <w:p>
+      <w:r>
+        <w:t>  Der Fall unbewohnter gemeindefreier Gebiete wurde geprüft; eine feinere gerichtete Logik würde nur minimal reduzieren und wird deshalb nicht implementiert.</w:t>
       </w:r>
     </w:p>
     <w:p/>
@@ -1682,6 +1829,7 @@
       </w:pPr>
       <w:bookmarkStart w:id="6" w:name="_Toc234510483"/>
       <w:r>
+        <w:lastRenderedPageBreak/>
         <w:t>Gemeinsame Behandlung der Briefwahl- und §-68-Verbindungen</w:t>
       </w:r>
       <w:bookmarkEnd w:id="6"/>
@@ -1720,7 +1868,6 @@
     </w:p>
     <w:p>
       <w:r>
-        <w:lastRenderedPageBreak/>
         <w:t>A, B, C</w:t>
       </w:r>
       <w:r>
@@ -1730,7 +1877,15 @@
     </w:p>
     <w:p>
       <w:r>
-        <w:t>Damit wird verhindert, dass ein Gemeindeschlüssel gleichzeitig in mehreren unterschiedlichen Aggregationen vorkommt. Jeder Gemeindeschlüssel muss innerhalb eines Wahljahres genau einem eindeutigen agg.schlüssel zugeordnet sein.</w:t>
+        <w:t xml:space="preserve">Damit wird verhindert, dass ein Gemeindeschlüssel gleichzeitig in mehreren unterschiedlichen Aggregationen vorkommt. Jeder Gemeindeschlüssel muss innerhalb eines Wahljahres genau einem eindeutigen </w:t>
+      </w:r>
+      <w:proofErr w:type="spellStart"/>
+      <w:r>
+        <w:t>agg.schlüssel</w:t>
+      </w:r>
+      <w:proofErr w:type="spellEnd"/>
+      <w:r>
+        <w:t xml:space="preserve"> zugeordnet sein.</w:t>
       </w:r>
     </w:p>
     <w:p>
@@ -1820,11 +1975,28 @@
     </w:p>
     <w:p>
       <w:r>
-        <w:t>Jede relevante Gebietsänderung liefert zunächst eine Beziehung zwischen AGS_alt und AGS_neu. Auch diese Beziehungen werden transitiv zusammengeführt. Beispielsweise führen</w:t>
-      </w:r>
-    </w:p>
-    <w:p>
-      <w:r>
+        <w:t xml:space="preserve">Jede relevante Gebietsänderung liefert zunächst eine Beziehung zwischen </w:t>
+      </w:r>
+      <w:proofErr w:type="spellStart"/>
+      <w:r>
+        <w:t>AGS_alt</w:t>
+      </w:r>
+      <w:proofErr w:type="spellEnd"/>
+      <w:r>
+        <w:t xml:space="preserve"> und </w:t>
+      </w:r>
+      <w:proofErr w:type="spellStart"/>
+      <w:r>
+        <w:t>AGS_neu</w:t>
+      </w:r>
+      <w:proofErr w:type="spellEnd"/>
+      <w:r>
+        <w:t>. Auch diese Beziehungen werden transitiv zusammengeführt. Beispielsweise führen</w:t>
+      </w:r>
+    </w:p>
+    <w:p>
+      <w:r>
+        <w:lastRenderedPageBreak/>
         <w:t>A → B</w:t>
       </w:r>
       <w:r>
@@ -1833,7 +2005,14 @@
       </w:r>
       <w:r>
         <w:br/>
-        <w:t>C → D</w:t>
+      </w:r>
+      <w:proofErr w:type="spellStart"/>
+      <w:r>
+        <w:t>C</w:t>
+      </w:r>
+      <w:proofErr w:type="spellEnd"/>
+      <w:r>
+        <w:t xml:space="preserve"> → D</w:t>
       </w:r>
     </w:p>
     <w:p>
@@ -1848,7 +2027,15 @@
     </w:p>
     <w:p>
       <w:r>
-        <w:t>Das ermöglicht eine harmonisierte Betrachtung auch dann, wenn bestimmte Schlüssel nur in einem der beiden Wahljahre existieren. Enthält der endgültige agg.schlüssel etwa einen alten Schlüssel A und die späteren Schlüssel B und C, werden 2021 nur die damals vorhandenen Datensätze und 2025 nur die dann vorhandenen Datensätze summiert. Das Fehlen eines Schlüssels in einem Jahr wird nicht als fehlender Messwert oder als Nullstimme interpretiert; es existiert lediglich keine Datenzeile mit diesem historischen beziehungsweise zukünftigen AGS.</w:t>
+        <w:t xml:space="preserve">Das ermöglicht eine harmonisierte Betrachtung auch dann, wenn bestimmte Schlüssel nur in einem der beiden Wahljahre existieren. Enthält der endgültige </w:t>
+      </w:r>
+      <w:proofErr w:type="spellStart"/>
+      <w:r>
+        <w:t>agg.schlüssel</w:t>
+      </w:r>
+      <w:proofErr w:type="spellEnd"/>
+      <w:r>
+        <w:t xml:space="preserve"> etwa einen alten Schlüssel A und die späteren Schlüssel B und C, werden 2021 nur die damals vorhandenen Datensätze und 2025 nur die dann vorhandenen Datensätze summiert. Das Fehlen eines Schlüssels in einem Jahr wird nicht als fehlender Messwert oder als Nullstimme interpretiert; es existiert lediglich keine Datenzeile mit diesem historischen beziehungsweise zukünftigen AGS.</w:t>
       </w:r>
     </w:p>
     <w:p>
@@ -1864,7 +2051,6 @@
         </w:numPr>
       </w:pPr>
       <w:r>
-        <w:lastRenderedPageBreak/>
         <w:t xml:space="preserve">Fusionen mehrerer Gemeinden, </w:t>
       </w:r>
     </w:p>
@@ -1975,13 +2161,19 @@
     </w:p>
     <w:p>
       <w:r>
+        <w:lastRenderedPageBreak/>
         <w:t>Alle Gruppen mit mindestens einem gemeinsamen AGS werden wiederum transitiv vereinigt. Danach wird aus den finalen Gruppen ein Lookup erstellt:</w:t>
       </w:r>
     </w:p>
     <w:p>
       <w:r>
-        <w:t>Gemeindeschlüssel → endgültiger agg.schlüssel</w:t>
-      </w:r>
+        <w:t xml:space="preserve">Gemeindeschlüssel → endgültiger </w:t>
+      </w:r>
+      <w:proofErr w:type="spellStart"/>
+      <w:r>
+        <w:t>agg.schlüssel</w:t>
+      </w:r>
+      <w:proofErr w:type="spellEnd"/>
     </w:p>
     <w:p>
       <w:r>
@@ -1995,7 +2187,15 @@
     </w:p>
     <w:p>
       <w:r>
-        <w:t>Ein bloßer inner_join() zwischen den beiden Wahljahren wäre hierfür nicht ausreichend, da er Gemeinden oder Wahlkreiskombinationen, die nur in einem Jahr vorkommen, stillschweigend ausschließt.</w:t>
+        <w:t xml:space="preserve">Ein bloßer </w:t>
+      </w:r>
+      <w:proofErr w:type="spellStart"/>
+      <w:r>
+        <w:t>inner_join</w:t>
+      </w:r>
+      <w:proofErr w:type="spellEnd"/>
+      <w:r>
+        <w:t>() zwischen den beiden Wahljahren wäre hierfür nicht ausreichend, da er Gemeinden oder Wahlkreiskombinationen, die nur in einem Jahr vorkommen, stillschweigend ausschließt.</w:t>
       </w:r>
     </w:p>
     <w:p/>
@@ -2005,50 +2205,101 @@
       </w:pPr>
       <w:bookmarkStart w:id="9" w:name="_Toc234510486"/>
       <w:r>
+        <w:t>Aggregation der Wahlergebnisse</w:t>
+      </w:r>
+      <w:bookmarkEnd w:id="9"/>
+    </w:p>
+    <w:p>
+      <w:r>
+        <w:t xml:space="preserve">Das finale Mapping wird an die ursprünglichen Wahlbezirksdaten angefügt. Anschließend werden die Daten nach </w:t>
+      </w:r>
+      <w:proofErr w:type="spellStart"/>
+      <w:r>
+        <w:t>agg.schlüssel</w:t>
+      </w:r>
+      <w:proofErr w:type="spellEnd"/>
+      <w:r>
+        <w:t xml:space="preserve"> gruppiert und alle relevanten numerischen Ergebnisvariablen summiert.</w:t>
+      </w:r>
+    </w:p>
+    <w:p>
+      <w:r>
+        <w:t xml:space="preserve">Damit werden innerhalb jedes </w:t>
+      </w:r>
+      <w:proofErr w:type="spellStart"/>
+      <w:r>
+        <w:t>agg.schlüssel</w:t>
+      </w:r>
+      <w:proofErr w:type="spellEnd"/>
+      <w:r>
+        <w:t xml:space="preserve"> sämtliche Urnen-, Brief- und gegebenenfalls gemeinsam festgestellten Ergebnisse addiert. In deinem Skript werden die administrativen ID-Variablen zunächst explizit von den numerischen zu summierenden Variablen ausgeschlossen. </w:t>
+      </w:r>
+    </w:p>
+    <w:p>
+      <w:r>
+        <w:t>Zur Nachvollziehbarkeit werden zusätzlich die enthaltenen Gemeinden und Gemeindeschlüssel gespeichert. Das ermöglicht eine spätere Prüfung, aus welchen Ursprungsgebieten jede aggregierte Beobachtung besteht.</w:t>
+      </w:r>
+    </w:p>
+    <w:p>
+      <w:r>
+        <w:t xml:space="preserve">Ein Wahlkreis sollte dabei nur dann als eindeutiges Merkmal mitgeführt werden, wenn nachweislich jeder </w:t>
+      </w:r>
+      <w:proofErr w:type="spellStart"/>
+      <w:r>
+        <w:t>agg.schlüssel</w:t>
+      </w:r>
+      <w:proofErr w:type="spellEnd"/>
+      <w:r>
+        <w:t xml:space="preserve"> genau einem Wahlkreis angehört. Das Speichern von </w:t>
+      </w:r>
+      <w:proofErr w:type="spellStart"/>
+      <w:r>
+        <w:t>first</w:t>
+      </w:r>
+      <w:proofErr w:type="spellEnd"/>
+      <w:r>
+        <w:t>(Wahlkreis) wäre bei wahlkreisübergreifenden Einheiten irreführend. In solchen Fällen sollten entweder alle beteiligten Wahlkreise dokumentiert oder das Wahlkreismerkmal aus der finalen Einheitentabelle entfernt werden.</w:t>
+      </w:r>
+    </w:p>
+    <w:p/>
+    <w:p>
+      <w:pPr>
+        <w:pStyle w:val="berschrift2"/>
+      </w:pPr>
+      <w:bookmarkStart w:id="10" w:name="_Toc234510487"/>
+      <w:r>
+        <w:t>Warum möglichst kleine räumliche Einheiten angestrebt werden</w:t>
+      </w:r>
+      <w:bookmarkEnd w:id="10"/>
+    </w:p>
+    <w:p>
+      <w:r>
+        <w:t xml:space="preserve">Die Wahl der räumlichen Ebene ist unmittelbar mit der späteren Anwendung von </w:t>
+      </w:r>
+      <w:proofErr w:type="spellStart"/>
+      <w:r>
+        <w:t>nslphom</w:t>
+      </w:r>
+      <w:proofErr w:type="spellEnd"/>
+      <w:r>
+        <w:t xml:space="preserve"> verbunden. Das Verfahren nutzt die beobachteten Randverteilungen mehrerer räumlicher Einheiten, um die nicht beobachteten inneren Zellen der lokalen Wählerübergangstabellen zu schätzen. Es arbeitet unter einer Homogenitätsannahme, nach der die lokalen Übergangsstrukturen in einem gewissen Ausmaß miteinander verbunden beziehungsweise ähnlich sind. </w:t>
+      </w:r>
+    </w:p>
+    <w:p>
+      <w:r>
+        <w:t xml:space="preserve">Eine größere Zahl informativer räumlicher Einheiten liefert mehr Variation der Randverteilungen und damit mehr Informationen zur Einschränkung der Menge möglicher Übergangsmatrizen. Die Genauigkeit ökologischer Inferenz hängt allerdings nicht allein von der Zahl der Einheiten ab, sondern auch von der Zahl der Parteien beziehungsweise Tabellenzellen, der Verteilung der Stimmen zwischen den Einheiten und der Heterogenität der tatsächlichen lokalen Übergangsprozesse. Die Evaluationsliteratur zu </w:t>
+      </w:r>
+      <w:proofErr w:type="spellStart"/>
+      <w:r>
+        <w:t>nslphom</w:t>
+      </w:r>
+      <w:proofErr w:type="spellEnd"/>
+      <w:r>
+        <w:t xml:space="preserve"> nennt die Zahl der Einheiten, Wähler, </w:t>
+      </w:r>
+      <w:r>
         <w:lastRenderedPageBreak/>
-        <w:t>Aggregation der Wahlergebnisse</w:t>
-      </w:r>
-      <w:bookmarkEnd w:id="9"/>
-    </w:p>
-    <w:p>
-      <w:r>
-        <w:t>Das finale Mapping wird an die ursprünglichen Wahlbezirksdaten angefügt. Anschließend werden die Daten nach agg.schlüssel gruppiert und alle relevanten numerischen Ergebnisvariablen summiert.</w:t>
-      </w:r>
-    </w:p>
-    <w:p>
-      <w:r>
-        <w:t xml:space="preserve">Damit werden innerhalb jedes agg.schlüssel sämtliche Urnen-, Brief- und gegebenenfalls gemeinsam festgestellten Ergebnisse addiert. In deinem Skript werden die administrativen ID-Variablen zunächst explizit von den numerischen zu summierenden Variablen ausgeschlossen. </w:t>
-      </w:r>
-    </w:p>
-    <w:p>
-      <w:r>
-        <w:t>Zur Nachvollziehbarkeit werden zusätzlich die enthaltenen Gemeinden und Gemeindeschlüssel gespeichert. Das ermöglicht eine spätere Prüfung, aus welchen Ursprungsgebieten jede aggregierte Beobachtung besteht.</w:t>
-      </w:r>
-    </w:p>
-    <w:p>
-      <w:r>
-        <w:t>Ein Wahlkreis sollte dabei nur dann als eindeutiges Merkmal mitgeführt werden, wenn nachweislich jeder agg.schlüssel genau einem Wahlkreis angehört. Das Speichern von first(Wahlkreis) wäre bei wahlkreisübergreifenden Einheiten irreführend. In solchen Fällen sollten entweder alle beteiligten Wahlkreise dokumentiert oder das Wahlkreismerkmal aus der finalen Einheitentabelle entfernt werden.</w:t>
-      </w:r>
-    </w:p>
-    <w:p/>
-    <w:p>
-      <w:pPr>
-        <w:pStyle w:val="berschrift2"/>
-      </w:pPr>
-      <w:bookmarkStart w:id="10" w:name="_Toc234510487"/>
-      <w:r>
-        <w:t>Warum möglichst kleine räumliche Einheiten angestrebt werden</w:t>
-      </w:r>
-      <w:bookmarkEnd w:id="10"/>
-    </w:p>
-    <w:p>
-      <w:r>
-        <w:t xml:space="preserve">Die Wahl der räumlichen Ebene ist unmittelbar mit der späteren Anwendung von nslphom verbunden. Das Verfahren nutzt die beobachteten Randverteilungen mehrerer räumlicher Einheiten, um die nicht beobachteten inneren Zellen der lokalen Wählerübergangstabellen zu schätzen. Es arbeitet unter einer Homogenitätsannahme, nach der die lokalen Übergangsstrukturen in einem gewissen Ausmaß miteinander verbunden beziehungsweise ähnlich sind. </w:t>
-      </w:r>
-    </w:p>
-    <w:p>
-      <w:r>
-        <w:t xml:space="preserve">Eine größere Zahl informativer räumlicher Einheiten liefert mehr Variation der Randverteilungen und damit mehr Informationen zur Einschränkung der Menge möglicher Übergangsmatrizen. Die Genauigkeit ökologischer Inferenz hängt allerdings nicht allein von der Zahl der Einheiten ab, sondern auch von der Zahl der Parteien beziehungsweise Tabellenzellen, der Verteilung der Stimmen zwischen den Einheiten und der Heterogenität der tatsächlichen lokalen Übergangsprozesse. Die Evaluationsliteratur zu nslphom nennt die Zahl der Einheiten, Wähler, Zeilen und Spalten sowie deren Verteilung ausdrücklich als mögliche Einflussgrößen der Schätzqualität. </w:t>
+        <w:t xml:space="preserve">Zeilen und Spalten sowie deren Verteilung ausdrücklich als mögliche Einflussgrößen der Schätzqualität. </w:t>
       </w:r>
     </w:p>
     <w:p>
@@ -2063,11 +2314,7 @@
     </w:p>
     <w:p>
       <w:r>
-        <w:t xml:space="preserve">Kleinere räumliche Einheiten sind auch für die spätere Verknüpfung mit Strukturdaten vorteilhaft. Auf Wahlkreisebene werden häufig sehr unterschiedliche Siedlungs- und Sozialräume gemeinsam betrachtet, beispielsweise größere Städte, suburbane Gemeinden und ländliche Räume. Durch eine solche Aggregation können lokale Unterschiede in Einkommen, Bildung, Altersstruktur, Arbeitsmarkt oder Urbanität geglättet werden. Ein Zusammenhang </w:t>
-      </w:r>
-      <w:r>
-        <w:lastRenderedPageBreak/>
-        <w:t>zwischen einer strukturellen Eigenschaft und einer bestimmten Wählerwanderung kann dadurch abgeschwächt oder vollständig verdeckt werden.</w:t>
+        <w:t>Kleinere räumliche Einheiten sind auch für die spätere Verknüpfung mit Strukturdaten vorteilhaft. Auf Wahlkreisebene werden häufig sehr unterschiedliche Siedlungs- und Sozialräume gemeinsam betrachtet, beispielsweise größere Städte, suburbane Gemeinden und ländliche Räume. Durch eine solche Aggregation können lokale Unterschiede in Einkommen, Bildung, Altersstruktur, Arbeitsmarkt oder Urbanität geglättet werden. Ein Zusammenhang zwischen einer strukturellen Eigenschaft und einer bestimmten Wählerwanderung kann dadurch abgeschwächt oder vollständig verdeckt werden.</w:t>
       </w:r>
     </w:p>
     <w:p>
@@ -2107,9 +2354,14 @@
         <w:t>Aufbereitung und Aggregation der Wahlbezirksdaten</w:t>
       </w:r>
       <w:r>
-        <w:t xml:space="preserve"> - kurzfassung</w:t>
+        <w:t xml:space="preserve"> - </w:t>
+      </w:r>
+      <w:proofErr w:type="spellStart"/>
+      <w:r>
+        <w:t>kurzfassung</w:t>
       </w:r>
       <w:bookmarkEnd w:id="11"/>
+      <w:proofErr w:type="spellEnd"/>
     </w:p>
     <w:p>
       <w:r>
@@ -2129,6 +2381,7 @@
     </w:p>
     <w:p>
       <w:r>
+        <w:lastRenderedPageBreak/>
         <w:t xml:space="preserve">Ziel der Aufbereitung war die Bildung der </w:t>
       </w:r>
       <w:r>
@@ -2139,7 +2392,15 @@
         <w:t>kleinstmöglichen räumlichen Einheiten auf mindestens Gemeindeebene</w:t>
       </w:r>
       <w:r>
-        <w:t>, für die sämtliche Stimmen vollständig und überschneidungsfrei ausgewiesen werden können. Im Regelfall entspricht die Analyseeinheit daher einer einzelnen Gemeinde. Eine Zusammenfassung mehrerer Gemeinden erfolgt nur, wenn die Organisation der Stimmenauszählung keine eindeutige Zuordnung zu einzelnen Gemeinden erlaubt. Die entstehenden Einheiten werden durch einen agg.schlüssel bezeichnet, der alle zugehörigen Gemeindeschlüssel enthält.</w:t>
+        <w:t xml:space="preserve">, für die sämtliche Stimmen vollständig und überschneidungsfrei ausgewiesen werden können. Im Regelfall entspricht die Analyseeinheit daher einer einzelnen Gemeinde. Eine Zusammenfassung mehrerer Gemeinden erfolgt nur, wenn die Organisation der Stimmenauszählung keine eindeutige Zuordnung zu einzelnen Gemeinden erlaubt. Die entstehenden Einheiten werden durch einen </w:t>
+      </w:r>
+      <w:proofErr w:type="spellStart"/>
+      <w:r>
+        <w:t>agg.schlüssel</w:t>
+      </w:r>
+      <w:proofErr w:type="spellEnd"/>
+      <w:r>
+        <w:t xml:space="preserve"> bezeichnet, der alle zugehörigen Gemeindeschlüssel enthält.</w:t>
       </w:r>
     </w:p>
     <w:p>
@@ -2155,11 +2416,15 @@
         </w:r>
       </w:hyperlink>
       <w:r>
-        <w:t xml:space="preserve">) In den Wahlbezirksdaten werden diese Fälle durch technische Gemeindekennziffern und die Kennziffer der Briefwahlzugehörigkeit identifiziert. Die Urnenwahlergebnisse der beteiligten realen </w:t>
-      </w:r>
-      <w:r>
-        <w:lastRenderedPageBreak/>
-        <w:t>Gemeinden und das gemeinsam ausgewiesene Briefwahlergebnis werden deshalb demselben agg.schlüssel zugeordnet. Die technische Briefwahlgemeinde bildet keine eigenständige räumliche Beobachtungseinheit.</w:t>
+        <w:t xml:space="preserve">) In den Wahlbezirksdaten werden diese Fälle durch technische Gemeindekennziffern und die Kennziffer der Briefwahlzugehörigkeit identifiziert. Die Urnenwahlergebnisse der beteiligten realen Gemeinden und das gemeinsam ausgewiesene Briefwahlergebnis werden deshalb demselben </w:t>
+      </w:r>
+      <w:proofErr w:type="spellStart"/>
+      <w:r>
+        <w:t>agg.schlüssel</w:t>
+      </w:r>
+      <w:proofErr w:type="spellEnd"/>
+      <w:r>
+        <w:t xml:space="preserve"> zugeordnet. Die technische Briefwahlgemeinde bildet keine eigenständige räumliche Beobachtungseinheit.</w:t>
       </w:r>
     </w:p>
     <w:p>
@@ -2175,7 +2440,15 @@
         </w:r>
       </w:hyperlink>
       <w:r>
-        <w:t>) Liegen die beteiligten Wahlbezirke in verschiedenen Gemeinden, werden auch diese Gemeinden zu einer gemeinsamen Analyseeinheit zusammengefasst. Überschneiden sich Briefwahl- und §-68-Gruppen, werden sie transitiv vereinigt: Gehört beispielsweise eine Gemeinde sowohl zur Gruppe A–B als auch zur Gruppe B–C, entsteht die endgültige Einheit A–B–C. Dadurch kommt jeder Gemeindeschlüssel in genau einem agg.schlüssel vor.</w:t>
+        <w:t xml:space="preserve">) Liegen die beteiligten Wahlbezirke in verschiedenen Gemeinden, werden auch diese Gemeinden zu einer gemeinsamen Analyseeinheit zusammengefasst. Überschneiden sich Briefwahl- und §-68-Gruppen, werden sie transitiv vereinigt: Gehört beispielsweise eine Gemeinde sowohl zur Gruppe A–B als auch zur Gruppe B–C, entsteht die endgültige Einheit A–B–C. Dadurch kommt jeder Gemeindeschlüssel in genau einem </w:t>
+      </w:r>
+      <w:proofErr w:type="spellStart"/>
+      <w:r>
+        <w:t>agg.schlüssel</w:t>
+      </w:r>
+      <w:proofErr w:type="spellEnd"/>
+      <w:r>
+        <w:t xml:space="preserve"> vor.</w:t>
       </w:r>
     </w:p>
     <w:p>
@@ -2191,12 +2464,32 @@
         </w:r>
       </w:hyperlink>
       <w:r>
-        <w:t>) Berücksichtigt wurden Auflösungen, Teilausgliederungen und tatsächliche Änderungen des AGS. Alte und neue Gemeindeschlüssel wurden miteinander verbunden und ebenfalls transitiv zusammengeführt. Dadurch können etwa eine 2021 bestehende Gemeinde und ihre 2025 vorhandenen Nachfolgegemeinden derselben Analyseeinheit zugeordnet werden. Abschließend wurden sämtliche Aggregationsbedingungen aus beiden Wahljahren – gemeinsame Briefwahl, §-68-Fälle und Gemeindegebietsänderungen – zu einem einheitlichen Mapping verbunden. Derselbe finale agg.schlüssel wird somit in beiden Wahljahren verwendet; nicht mehr oder noch nicht existierende Schlüssel tragen im jeweiligen Jahr lediglich keine Beobachtungen zur Summe bei.</w:t>
-      </w:r>
-    </w:p>
-    <w:p>
-      <w:r>
-        <w:t>Die möglichst kleinräumige Abgrenzung ist sowohl für die spätere Anwendung von nslphom als auch für die Untersuchung regionaler Strukturfaktoren relevant. Eine größere Zahl informativer Einheiten stellt mehr unterschiedliche Randverteilungen für die ökologische Inferenz bereit und kann dadurch die Schätzung stabilisieren. Sie garantiert allerdings keine unverzerrte Schätzung, da das ökologische Identifikationsproblem nicht allein durch zusätzliche Einheiten aufgehoben wird und die Homogenitätsannahme weiterhin entscheidend bleibt. (</w:t>
+        <w:t xml:space="preserve">) Berücksichtigt wurden Auflösungen, Teilausgliederungen und tatsächliche Änderungen des AGS. Alte und neue Gemeindeschlüssel wurden miteinander verbunden und ebenfalls transitiv zusammengeführt. Dadurch können etwa eine 2021 bestehende Gemeinde und ihre 2025 vorhandenen Nachfolgegemeinden derselben Analyseeinheit zugeordnet werden. Abschließend wurden sämtliche Aggregationsbedingungen aus beiden Wahljahren – gemeinsame Briefwahl, §-68-Fälle und Gemeindegebietsänderungen – zu einem einheitlichen Mapping verbunden. Derselbe finale </w:t>
+      </w:r>
+      <w:proofErr w:type="spellStart"/>
+      <w:r>
+        <w:t>agg.schlüssel</w:t>
+      </w:r>
+      <w:proofErr w:type="spellEnd"/>
+      <w:r>
+        <w:t xml:space="preserve"> wird somit in beiden Wahljahren verwendet; nicht mehr oder noch nicht existierende Schlüssel tragen im jeweiligen Jahr lediglich keine Beobachtungen zur Summe bei.</w:t>
+      </w:r>
+    </w:p>
+    <w:p>
+      <w:r>
+        <w:t xml:space="preserve">Die möglichst kleinräumige Abgrenzung ist sowohl für die spätere Anwendung von </w:t>
+      </w:r>
+      <w:proofErr w:type="spellStart"/>
+      <w:r>
+        <w:t>nslphom</w:t>
+      </w:r>
+      <w:proofErr w:type="spellEnd"/>
+      <w:r>
+        <w:t xml:space="preserve"> als auch für die Untersuchung regionaler Strukturfaktoren relevant. Eine größere Zahl informativer Einheiten stellt mehr unterschiedliche Randverteilungen für die ökologische Inferenz bereit und kann dadurch die Schätzung stabilisieren. Sie garantiert allerdings keine unverzerrte Schätzung, da das ökologische Identifikationsproblem nicht allein durch zusätzliche Einheiten aufgehoben </w:t>
+      </w:r>
+      <w:r>
+        <w:lastRenderedPageBreak/>
+        <w:t>wird und die Homogenitätsannahme weiterhin entscheidend bleibt. (</w:t>
       </w:r>
       <w:hyperlink r:id="rId10" w:tooltip="Idescat. SORT. Data wrangling, computational burden, automation, robustness and accuracy in ecological inference forecasting of RxC tables. Volume 47 (1)" w:history="1">
         <w:r>
@@ -2207,7 +2500,15 @@
         </w:r>
       </w:hyperlink>
       <w:r>
-        <w:t xml:space="preserve">) Gleichzeitig bleiben auf Gemeindeebene Unterschiede etwa zwischen städtischen, suburbanen und ländlichen Räumen besser erhalten. Eine unmittelbare Aggregation auf Wahlkreisebene würde sehr unterschiedliche Gemeinden zusammenfassen, Strukturmerkmale mitteln und potenziell relevante lokale Zusammenhänge mit Wählerwanderungen verdecken. Die Aggregationsregel folgt daher dem Grundsatz: </w:t>
+        <w:t xml:space="preserve">) Gleichzeitig bleiben auf Gemeindeebene Unterschiede etwa zwischen städtischen, suburbanen und ländlichen Räumen besser erhalten. Eine unmittelbare Aggregation auf Wahlkreisebene würde sehr unterschiedliche Gemeinden zusammenfassen, Strukturmerkmale </w:t>
+      </w:r>
+      <w:proofErr w:type="spellStart"/>
+      <w:r>
+        <w:t>mitteln</w:t>
+      </w:r>
+      <w:proofErr w:type="spellEnd"/>
+      <w:r>
+        <w:t xml:space="preserve"> und potenziell relevante lokale Zusammenhänge mit Wählerwanderungen verdecken. Die Aggregationsregel folgt daher dem Grundsatz: </w:t>
       </w:r>
       <w:r>
         <w:rPr>
@@ -4309,7 +4610,6 @@
   <w:style w:type="character" w:default="1" w:styleId="Absatz-Standardschriftart">
     <w:name w:val="Default Paragraph Font"/>
     <w:uiPriority w:val="1"/>
-    <w:semiHidden/>
     <w:unhideWhenUsed/>
   </w:style>
   <w:style w:type="table" w:default="1" w:styleId="NormaleTabelle">

</xml_diff>